<commit_message>
Deep cleanup: delete audit_text.txt + reader scripts, strip KCA University affiliation, remove all references to deleted CAJ/KCA docs
</commit_message>
<xml_diff>
--- a/docs/PROJECT_COMPLETION_SUMMARY.docx
+++ b/docs/PROJECT_COMPLETION_SUMMARY.docx
@@ -94,20 +94,6 @@
     <w:p>
       <w:r>
         <w:t xml:space="preserve">Legal framework for AI in public health</w:t>
-      </w:r>
-    </w:p>
-    <w:p>
-      <w:r>
-        <w:rPr>
-          <w:b/>
-          <w:bCs/>
-        </w:rPr>
-        <w:t xml:space="preserve">2. CAJ 21-Day Disclosure Document (CAJ_21_DAY_DISCLOSURE.docx)</w:t>
-      </w:r>
-    </w:p>
-    <w:p>
-      <w:r>
-        <w:t xml:space="preserve">Court disclosure requirements</w:t>
       </w:r>
     </w:p>
     <w:p>

</xml_diff>